<commit_message>
Package workflow kits and book handoff updates
</commit_message>
<xml_diff>
--- a/output/doc/production-calibre-handoff-2026-05-20/Startup Operational Excellence - signed review copy.docx
+++ b/output/doc/production-calibre-handoff-2026-05-20/Startup Operational Excellence - signed review copy.docx
@@ -71,6 +71,61 @@
     <w:p>
       <w:r>
         <w:t>Draft review edition</w:t>
+      </w:r>
+    </w:p>
+    <w:p>
+      <w:r>
+        <w:br w:type="page"/>
+      </w:r>
+    </w:p>
+    <w:p>
+      <w:pPr>
+        <w:pStyle w:val="Heading1"/>
+        <w:jc w:val="center"/>
+      </w:pPr>
+      <w:r>
+        <w:t>Dedication</w:t>
+      </w:r>
+    </w:p>
+    <w:p>
+      <w:pPr>
+        <w:spacing w:after="240"/>
+        <w:jc w:val="center"/>
+      </w:pPr>
+      <w:r>
+        <w:rPr>
+          <w:i/>
+        </w:rPr>
+        <w:t>Dedicated to my Lord and Saviour Jesus Christ, without whom this book could not exist. He introduced the concept of servant leadership.</w:t>
+      </w:r>
+    </w:p>
+    <w:p>
+      <w:pPr>
+        <w:spacing w:after="240"/>
+        <w:jc w:val="center"/>
+      </w:pPr>
+      <w:r>
+        <w:rPr>
+          <w:i/>
+        </w:rPr>
+        <w:t>To my niece Kayla, without whom this agency would not exist, and to my co-founder and best friend Sheena Burns, without whom I would have given up on this effort months ago.</w:t>
+      </w:r>
+    </w:p>
+    <w:p>
+      <w:pPr>
+        <w:spacing w:after="240"/>
+        <w:jc w:val="center"/>
+      </w:pPr>
+      <w:r>
+        <w:rPr>
+          <w:i/>
+        </w:rPr>
+        <w:t>Special thanks to Pastor Pete, my spiritual cover and mentor, and to Sharyn Spitznagel, the coach and mentor who has been along for the ride since it all started.</w:t>
+      </w:r>
+    </w:p>
+    <w:p>
+      <w:r>
+        <w:br w:type="page"/>
       </w:r>
     </w:p>
     <w:p>

</xml_diff>